<commit_message>
Update cold call pitch and service agreement for two-service model
- Cold call pitch: replace three-package Starter/Growth/Pro model with the
  two actual services (Website + LM at $750/$69, Lead Intake + LM at $400/$59);
  update all pricing references, ROI table, and full call script accordingly;
  add "Which Service to Lead With" tip for pre-call research
- Service agreement Section 7: clarify website stays live after cancellation
  (client paid for the build); correct that lead data will be exported and sent
  as CSV; add offboarding language explaining the form will be updated to
  email-only forwarding as a courtesy — so the form stays functional

Co-Authored-By: Claude Sonnet 4.6 <noreply@anthropic.com>
</commit_message>
<xml_diff>
--- a/Cold Call Sales Pitch — How-To Guide.docx
+++ b/Cold Call Sales Pitch — How-To Guide.docx
@@ -44,7 +44,7 @@
           <w:color w:val="1C1C1A"/>
           <w:sz w:val="22"/>
         </w:rPr>
-        <w:t>A ready-to-use script for selling websites &amp; lead management to small service businesses</w:t>
+        <w:t>A ready-to-use script for selling website + lead management services to small service businesses</w:t>
       </w:r>
     </w:p>
     <w:p>
@@ -524,7 +524,7 @@
           <w:color w:val="1C1C1A"/>
           <w:sz w:val="22"/>
         </w:rPr>
-        <w:t>You sell two things that work together: a professional website and a lead management system. The website puts the business on the map. The lead system makes sure no customer inquiry falls through the cracks. Together, they turn a phone that barely rings into a pipeline of organized, ready-to-call leads.</w:t>
+        <w:t>You offer two services. The first is for businesses that need everything — a professional website and a full lead management system built in. The second is for businesses that already have a website but are losing leads because nothing is capturing or tracking them. Both services include the same lead management backbone: instant alerts, an organized lead log, monthly reports, and ongoing support.</w:t>
       </w:r>
     </w:p>
     <w:p>
@@ -538,7 +538,7 @@
           <w:color w:val="1A3A2A"/>
           <w:sz w:val="24"/>
         </w:rPr>
-        <w:t>The Three Packages</w:t>
+        <w:t>The Two Services</w:t>
       </w:r>
     </w:p>
     <w:tbl>
@@ -578,7 +578,7 @@
                 <w:color w:val="FFFFFF"/>
                 <w:sz w:val="22"/>
               </w:rPr>
-              <w:t>Package</w:t>
+              <w:t>Service</w:t>
             </w:r>
           </w:p>
         </w:tc>
@@ -625,9 +625,9 @@
                 <w:color w:val="1A3A2A"/>
                 <w:sz w:val="22"/>
               </w:rPr>
-              <w:t>Starter</w:t>
+              <w:t>Website + Lead Management</w:t>
               <w:br/>
-              <w:t>$800 setup + $79/mo</w:t>
+              <w:t>$750 setup + $69/mo</w:t>
             </w:r>
           </w:p>
         </w:tc>
@@ -648,7 +648,7 @@
                 <w:color w:val="1C1C1A"/>
                 <w:sz w:val="22"/>
               </w:rPr>
-              <w:t>Professional one-page website, lead intake form, Google Sheets lead tracker, 1 content update/month, custom domain connected</w:t>
+              <w:t>Professional one-page website, lead intake form (built in), instant email + text alert for every lead, Google Sheets lead log, monthly lead summary report, quarterly Google Business Profile audit, speed-to-lead facts sheet, form updates always included, ongoing site edits, custom domain connected</w:t>
             </w:r>
           </w:p>
         </w:tc>
@@ -672,9 +672,9 @@
                 <w:color w:val="1A3A2A"/>
                 <w:sz w:val="22"/>
               </w:rPr>
-              <w:t>Growth — Most Popular</w:t>
+              <w:t>Lead Intake + Lead Management</w:t>
               <w:br/>
-              <w:t>$1,200 setup + $99/mo</w:t>
+              <w:t>$400 setup + $59/mo</w:t>
             </w:r>
           </w:p>
         </w:tc>
@@ -695,54 +695,7 @@
                 <w:color w:val="1C1C1A"/>
                 <w:sz w:val="22"/>
               </w:rPr>
-              <w:t>Everything in Starter plus real-time lead alerts, morning lead digest emailed to you, 3 content updates/month</w:t>
-            </w:r>
-          </w:p>
-        </w:tc>
-      </w:tr>
-      <w:tr>
-        <w:tc>
-          <w:tcPr>
-            <w:tcW w:type="dxa" w:w="2520"/>
-            <w:tcMar>
-              <w:top w:w="80" w:type="dxa"/>
-              <w:bottom w:w="80" w:type="dxa"/>
-              <w:left w:w="115" w:type="dxa"/>
-              <w:right w:w="115" w:type="dxa"/>
-            </w:tcMar>
-          </w:tcPr>
-          <w:p>
-            <w:r>
-              <w:rPr>
-                <w:rFonts w:ascii="Arial" w:hAnsi="Arial"/>
-                <w:b/>
-                <w:color w:val="1A3A2A"/>
-                <w:sz w:val="22"/>
-              </w:rPr>
-              <w:t>Pro</w:t>
-              <w:br/>
-              <w:t>$1,500 setup + $139/mo</w:t>
-            </w:r>
-          </w:p>
-        </w:tc>
-        <w:tc>
-          <w:tcPr>
-            <w:tcW w:type="dxa" w:w="6480"/>
-            <w:tcMar>
-              <w:top w:w="80" w:type="dxa"/>
-              <w:bottom w:w="80" w:type="dxa"/>
-              <w:left w:w="115" w:type="dxa"/>
-              <w:right w:w="115" w:type="dxa"/>
-            </w:tcMar>
-          </w:tcPr>
-          <w:p>
-            <w:r>
-              <w:rPr>
-                <w:rFonts w:ascii="Arial" w:hAnsi="Arial"/>
-                <w:color w:val="1C1C1A"/>
-                <w:sz w:val="22"/>
-              </w:rPr>
-              <w:t>Everything in Growth plus Google Business Profile setup, 6 content updates/month — maximum local visibility</w:t>
+              <w:t>Lead intake form added to their existing website, instant email + text alert for every lead, Google Sheets lead log, monthly lead summary report, quarterly Google Business Profile audit, speed-to-lead facts sheet, form updates always included — no new website needed</w:t>
             </w:r>
           </w:p>
         </w:tc>
@@ -752,6 +705,33 @@
       <w:pPr>
         <w:spacing w:before="0" w:after="80"/>
       </w:pPr>
+    </w:p>
+    <w:p>
+      <w:pPr>
+        <w:spacing w:before="220" w:after="120"/>
+      </w:pPr>
+      <w:r>
+        <w:rPr>
+          <w:rFonts w:ascii="Arial" w:hAnsi="Arial"/>
+          <w:b/>
+          <w:color w:val="1A3A2A"/>
+          <w:sz w:val="24"/>
+        </w:rPr>
+        <w:t>Which Service to Lead With</w:t>
+      </w:r>
+    </w:p>
+    <w:p>
+      <w:pPr>
+        <w:spacing w:before="0" w:after="120"/>
+      </w:pPr>
+      <w:r>
+        <w:rPr>
+          <w:rFonts w:ascii="Arial" w:hAnsi="Arial"/>
+          <w:color w:val="1C1C1A"/>
+          <w:sz w:val="22"/>
+        </w:rPr>
+        <w:t>Before the call, do a quick Google search on the prospect. If they have no website or a weak one, lead with Website + Lead Management. If they already have a decent website, lead with Lead Intake + Lead Management — it's a lower barrier to entry and solves a more immediate problem.</w:t>
+      </w:r>
     </w:p>
     <w:p>
       <w:pPr>
@@ -1482,7 +1462,7 @@
           <w:color w:val="1C1C1A"/>
           <w:sz w:val="22"/>
         </w:rPr>
-        <w:t>Affordable — less than $100 a month for the Growth package.</w:t>
+        <w:t>Affordable — $69/month for the full website + lead management package. $59/month if they already have a site.</w:t>
       </w:r>
     </w:p>
     <w:p>
@@ -1765,7 +1745,7 @@
                 <w:color w:val="1A3A2A"/>
                 <w:sz w:val="22"/>
               </w:rPr>
-              <w:t>Growth package cost</w:t>
+              <w:t>Website + Lead Management cost</w:t>
             </w:r>
           </w:p>
         </w:tc>
@@ -1786,7 +1766,52 @@
                 <w:color w:val="1C1C1A"/>
                 <w:sz w:val="22"/>
               </w:rPr>
-              <w:t>$99/month after a one-time $1,200 setup fee</w:t>
+              <w:t>$69/month after a one-time $750 setup fee</w:t>
+            </w:r>
+          </w:p>
+        </w:tc>
+      </w:tr>
+      <w:tr>
+        <w:tc>
+          <w:tcPr>
+            <w:tcW w:type="dxa" w:w="2520"/>
+            <w:tcMar>
+              <w:top w:w="80" w:type="dxa"/>
+              <w:bottom w:w="80" w:type="dxa"/>
+              <w:left w:w="115" w:type="dxa"/>
+              <w:right w:w="115" w:type="dxa"/>
+            </w:tcMar>
+          </w:tcPr>
+          <w:p>
+            <w:r>
+              <w:rPr>
+                <w:rFonts w:ascii="Arial" w:hAnsi="Arial"/>
+                <w:b/>
+                <w:color w:val="1A3A2A"/>
+                <w:sz w:val="22"/>
+              </w:rPr>
+              <w:t>Lead Intake + Lead Management</w:t>
+            </w:r>
+          </w:p>
+        </w:tc>
+        <w:tc>
+          <w:tcPr>
+            <w:tcW w:type="dxa" w:w="6480"/>
+            <w:tcMar>
+              <w:top w:w="80" w:type="dxa"/>
+              <w:bottom w:w="80" w:type="dxa"/>
+              <w:left w:w="115" w:type="dxa"/>
+              <w:right w:w="115" w:type="dxa"/>
+            </w:tcMar>
+          </w:tcPr>
+          <w:p>
+            <w:r>
+              <w:rPr>
+                <w:rFonts w:ascii="Arial" w:hAnsi="Arial"/>
+                <w:color w:val="1C1C1A"/>
+                <w:sz w:val="22"/>
+              </w:rPr>
+              <w:t>$59/month after a one-time $400 setup fee</w:t>
             </w:r>
           </w:p>
         </w:tc>
@@ -1831,7 +1856,7 @@
                 <w:color w:val="1C1C1A"/>
                 <w:sz w:val="22"/>
               </w:rPr>
-              <w:t>One saved job covers 12 months of service fees</w:t>
+              <w:t>One saved job covers a full year of monthly fees</w:t>
             </w:r>
           </w:p>
         </w:tc>
@@ -1876,7 +1901,7 @@
                 <w:color w:val="1C1C1A"/>
                 <w:sz w:val="22"/>
               </w:rPr>
-              <w:t>$600 recovered – $99 cost = $501 net gain, every month</w:t>
+              <w:t>$600 recovered – $69 cost = $531 net gain, every month</w:t>
             </w:r>
           </w:p>
         </w:tc>
@@ -1912,7 +1937,7 @@
           <w:color w:val="1C1C1A"/>
           <w:sz w:val="18"/>
         </w:rPr>
-        <w:t>"Here's the honest math — if you're a plumber and the average job is $600, and you recover even one lead a month that you would have missed otherwise, that's $600 coming in against $99 going out. The service pays for itself the first time your phone buzzes with a lead while you're under a sink."</w:t>
+        <w:t>"Here's the honest math — if you're a plumber and the average job is $600, and you recover even one lead a month that you would have missed otherwise, that's $600 coming in against $69 going out. The service pays for itself the first time your phone buzzes with a lead while you're under a sink."</w:t>
       </w:r>
     </w:p>
     <w:p>
@@ -2071,7 +2096,7 @@
           <w:color w:val="1C1C1A"/>
           <w:sz w:val="18"/>
         </w:rPr>
-        <w:t>"What I do is build you a professional website that looks great on a phone — because that's how people are searching — and I wire up a system so that every lead that comes in goes straight to your inbox within minutes, organized and ready to call back. You're not staring at a spreadsheet. You're just getting a text that says: 'New lead — Maria G., kitchen remodel, $12K budget, wants to start in 3 weeks. Call today.' You're live in under a week. And it costs less than $100 a month after setup."</w:t>
+        <w:t>"What I do is build you a professional website that looks great on a phone — because that's how people are searching — and I wire up a system so that every lead that comes in goes straight to your inbox within minutes, organized and ready to call back. You're not staring at a spreadsheet. You're just getting a text that says: 'New lead — Maria G., kitchen remodel, $12K budget, wants to start in 3 weeks. Call today.' You're live in under a week. And it's $69 a month after a one-time setup fee."</w:t>
       </w:r>
     </w:p>
     <w:p>
@@ -2099,7 +2124,7 @@
           <w:color w:val="1C1C1A"/>
           <w:sz w:val="18"/>
         </w:rPr>
-        <w:t>"Here's the math — if your average job is $600 and you recover even one lead a month you would have missed, the service pays for itself six times over. One saved job covers a full year of my fee. And if it doesn't work in the first 60 days — if you're not getting leads or you're not happy for any reason — I refund every monthly payment, no questions. I take all the risk on this."</w:t>
+        <w:t>"Here's the math — if your average job is $600 and you recover even one lead a month you would have missed, you're up $531 that month alone. One saved job covers a full year of my fee. And if it doesn't work in the first 60 days — if you're not getting leads or you're not happy for any reason — I refund every monthly payment, no questions. I take all the risk on this."</w:t>
       </w:r>
     </w:p>
     <w:p>
@@ -2611,7 +2636,7 @@
                 <w:color w:val="FFFFFF"/>
                 <w:sz w:val="22"/>
               </w:rPr>
-              <w:t>Package</w:t>
+              <w:t>Service</w:t>
             </w:r>
           </w:p>
         </w:tc>
@@ -2658,7 +2683,7 @@
                 <w:color w:val="1A3A2A"/>
                 <w:sz w:val="22"/>
               </w:rPr>
-              <w:t>Starter</w:t>
+              <w:t>Website + Lead Management</w:t>
             </w:r>
           </w:p>
         </w:tc>
@@ -2679,7 +2704,7 @@
                 <w:color w:val="1C1C1A"/>
                 <w:sz w:val="22"/>
               </w:rPr>
-              <w:t>$800 setup — $79/month</w:t>
+              <w:t>$750 setup — $69/month</w:t>
             </w:r>
           </w:p>
         </w:tc>
@@ -2703,7 +2728,7 @@
                 <w:color w:val="1A3A2A"/>
                 <w:sz w:val="22"/>
               </w:rPr>
-              <w:t>Growth (Most Popular)</w:t>
+              <w:t>Lead Intake + Lead Management</w:t>
             </w:r>
           </w:p>
         </w:tc>
@@ -2724,52 +2749,7 @@
                 <w:color w:val="1C1C1A"/>
                 <w:sz w:val="22"/>
               </w:rPr>
-              <w:t>$1,200 setup — $99/month</w:t>
-            </w:r>
-          </w:p>
-        </w:tc>
-      </w:tr>
-      <w:tr>
-        <w:tc>
-          <w:tcPr>
-            <w:tcW w:type="dxa" w:w="2520"/>
-            <w:tcMar>
-              <w:top w:w="80" w:type="dxa"/>
-              <w:bottom w:w="80" w:type="dxa"/>
-              <w:left w:w="115" w:type="dxa"/>
-              <w:right w:w="115" w:type="dxa"/>
-            </w:tcMar>
-          </w:tcPr>
-          <w:p>
-            <w:r>
-              <w:rPr>
-                <w:rFonts w:ascii="Arial" w:hAnsi="Arial"/>
-                <w:b/>
-                <w:color w:val="1A3A2A"/>
-                <w:sz w:val="22"/>
-              </w:rPr>
-              <w:t>Pro</w:t>
-            </w:r>
-          </w:p>
-        </w:tc>
-        <w:tc>
-          <w:tcPr>
-            <w:tcW w:type="dxa" w:w="6480"/>
-            <w:tcMar>
-              <w:top w:w="80" w:type="dxa"/>
-              <w:bottom w:w="80" w:type="dxa"/>
-              <w:left w:w="115" w:type="dxa"/>
-              <w:right w:w="115" w:type="dxa"/>
-            </w:tcMar>
-          </w:tcPr>
-          <w:p>
-            <w:r>
-              <w:rPr>
-                <w:rFonts w:ascii="Arial" w:hAnsi="Arial"/>
-                <w:color w:val="1C1C1A"/>
-                <w:sz w:val="22"/>
-              </w:rPr>
-              <w:t>$1,500 setup — $139/month</w:t>
+              <w:t>$400 setup — $59/month</w:t>
             </w:r>
           </w:p>
         </w:tc>

</xml_diff>